<commit_message>
Relabel projects 05-06 and template
</commit_message>
<xml_diff>
--- a/templates/acceptable-use-policy-template.docx
+++ b/templates/acceptable-use-policy-template.docx
@@ -39,7 +39,7 @@
         <w:t xml:space="preserve"> </w:t>
       </w:r>
       <w:r>
-        <w:t xml:space="preserve">Replace every [BRACKETED] field. Delete any clause that does not apply to the organisation, and delete this note before issuing. Originally developed for a fictional portfolio scenario by O.S, 2026.</w:t>
+        <w:t xml:space="preserve">Replace every [BRACKETED] field. Delete any clause that does not apply to the organisation, and delete this note before issuing. Originally developed for a simulated portfolio scenario by O.S, 2026.</w:t>
       </w:r>
     </w:p>
     <w:tbl>
@@ -3957,7 +3957,7 @@
         <w:color w:val="6B7280"/>
         <w:sz w:val="15"/>
       </w:rPr>
-      <w:t xml:space="preserve">Fictional portfolio case study  ·  Prepared by O.S  ·  Page </w:t>
+      <w:t xml:space="preserve">Simulated case study  ·  Prepared by O.S  ·  Page </w:t>
     </w:r>
     <w:r>
       <w:rPr>

</xml_diff>

<commit_message>
Templates: remove case-study branding, credit Olugboye Shola
All 15 templates (md, csv, docx, xlsx) are now unbranded: no scenario names,
project IDs or case-study notices. Each carries one credit line.

Claude-Session: https://claude.ai/code/session_0165XZisJZG4P3mrG9rbChTW
</commit_message>
<xml_diff>
--- a/templates/acceptable-use-policy-template.docx
+++ b/templates/acceptable-use-policy-template.docx
@@ -39,7 +39,7 @@
         <w:t xml:space="preserve"> </w:t>
       </w:r>
       <w:r>
-        <w:t xml:space="preserve">Replace every [BRACKETED] field. Delete any clause that does not apply to the organisation, and delete this note before issuing. Originally developed for a simulated portfolio scenario by O.S, 2026.</w:t>
+        <w:t>Replace every [BRACKETED] field. Delete any clause that does not apply to the organisation, and delete this note before issuing. Prepared by Olugboye Shola.</w:t>
       </w:r>
     </w:p>
     <w:tbl>
@@ -3933,6 +3933,10 @@
     <w:sectPr>
       <w:headerReference w:type="default" r:id="rId9"/>
       <w:footerReference w:type="default" r:id="rId10"/>
+      <w:headerReference w:type="first" r:id="rId11"/>
+      <w:footerReference w:type="first" r:id="rId12"/>
+      <w:headerReference w:type="even" r:id="rId13"/>
+      <w:footerReference w:type="even" r:id="rId14"/>
       <w:pgSz w:w="11906" w:h="16838"/>
       <w:pgMar w:left="1077" w:right="1077" w:top="1134" w:bottom="1020"/>
     </w:sectPr>
@@ -3957,7 +3961,7 @@
         <w:color w:val="6B7280"/>
         <w:sz w:val="15"/>
       </w:rPr>
-      <w:t xml:space="preserve">Simulated case study  ·  Prepared by O.S  ·  Page </w:t>
+      <w:t xml:space="preserve">Prepared by Olugboye Shola  ·  Page </w:t>
     </w:r>
     <w:r>
       <w:rPr>
@@ -3990,6 +3994,26 @@
 </w:ftr>
 </file>
 
+<file path=word/footer2.xml><?xml version="1.0" encoding="utf-8"?>
+<w:ftr xmlns:m="http://schemas.openxmlformats.org/officeDocument/2006/math" xmlns:mc="http://schemas.openxmlformats.org/markup-compatibility/2006" xmlns:mo="http://schemas.microsoft.com/office/mac/office/2008/main" xmlns:mv="urn:schemas-microsoft-com:mac:vml" xmlns:o="urn:schemas-microsoft-com:office:office" xmlns:r="http://schemas.openxmlformats.org/officeDocument/2006/relationships" xmlns:v="urn:schemas-microsoft-com:vml" xmlns:w10="urn:schemas-microsoft-com:office:word" xmlns:w14="http://schemas.microsoft.com/office/word/2010/wordml" xmlns:w="http://schemas.openxmlformats.org/wordprocessingml/2006/main" xmlns:wne="http://schemas.microsoft.com/office/word/2006/wordml" xmlns:wp14="http://schemas.microsoft.com/office/word/2010/wordprocessingDrawing" xmlns:wp="http://schemas.openxmlformats.org/drawingml/2006/wordprocessingDrawing" xmlns:wpc="http://schemas.microsoft.com/office/word/2010/wordprocessingCanvas" xmlns:wpg="http://schemas.microsoft.com/office/word/2010/wordprocessingGroup" xmlns:wpi="http://schemas.microsoft.com/office/word/2010/wordprocessingInk" xmlns:wps="http://schemas.microsoft.com/office/word/2010/wordprocessingShape" mc:Ignorable="w14 wp14">
+  <w:p>
+    <w:pPr>
+      <w:pStyle w:val="Footer"/>
+    </w:pPr>
+  </w:p>
+</w:ftr>
+</file>
+
+<file path=word/footer3.xml><?xml version="1.0" encoding="utf-8"?>
+<w:ftr xmlns:m="http://schemas.openxmlformats.org/officeDocument/2006/math" xmlns:mc="http://schemas.openxmlformats.org/markup-compatibility/2006" xmlns:mo="http://schemas.microsoft.com/office/mac/office/2008/main" xmlns:mv="urn:schemas-microsoft-com:mac:vml" xmlns:o="urn:schemas-microsoft-com:office:office" xmlns:r="http://schemas.openxmlformats.org/officeDocument/2006/relationships" xmlns:v="urn:schemas-microsoft-com:vml" xmlns:w10="urn:schemas-microsoft-com:office:word" xmlns:w14="http://schemas.microsoft.com/office/word/2010/wordml" xmlns:w="http://schemas.openxmlformats.org/wordprocessingml/2006/main" xmlns:wne="http://schemas.microsoft.com/office/word/2006/wordml" xmlns:wp14="http://schemas.microsoft.com/office/word/2010/wordprocessingDrawing" xmlns:wp="http://schemas.openxmlformats.org/drawingml/2006/wordprocessingDrawing" xmlns:wpc="http://schemas.microsoft.com/office/word/2010/wordprocessingCanvas" xmlns:wpg="http://schemas.microsoft.com/office/word/2010/wordprocessingGroup" xmlns:wpi="http://schemas.microsoft.com/office/word/2010/wordprocessingInk" xmlns:wps="http://schemas.microsoft.com/office/word/2010/wordprocessingShape" mc:Ignorable="w14 wp14">
+  <w:p>
+    <w:pPr>
+      <w:pStyle w:val="Footer"/>
+    </w:pPr>
+  </w:p>
+</w:ftr>
+</file>
+
 <file path=word/footnotes.xml><?xml version="1.0" encoding="utf-8"?>
 <w:footnotes xmlns:w="http://schemas.openxmlformats.org/wordprocessingml/2006/main" xmlns:m="http://schemas.openxmlformats.org/officeDocument/2006/math" xmlns:r="http://schemas.openxmlformats.org/officeDocument/2006/relationships" xmlns:o="urn:schemas-microsoft-com:office:office" xmlns:v="urn:schemas-microsoft-com:vml" xmlns:w10="urn:schemas-microsoft-com:office:word" xmlns:a="http://schemas.openxmlformats.org/drawingml/2006/main" xmlns:pic="http://schemas.openxmlformats.org/drawingml/2006/picture" xmlns:wp="http://schemas.openxmlformats.org/drawingml/2006/wordprocessingDrawing">
   <w:footnote w:type="continuationSeparator" w:id="0">
@@ -4024,6 +4048,26 @@
       </w:rPr>
       <w:t>ACCEPTABLE USE POLICY | REUSABLE TEMPLATE</w:t>
     </w:r>
+  </w:p>
+</w:hdr>
+</file>
+
+<file path=word/header2.xml><?xml version="1.0" encoding="utf-8"?>
+<w:hdr xmlns:m="http://schemas.openxmlformats.org/officeDocument/2006/math" xmlns:mc="http://schemas.openxmlformats.org/markup-compatibility/2006" xmlns:mo="http://schemas.microsoft.com/office/mac/office/2008/main" xmlns:mv="urn:schemas-microsoft-com:mac:vml" xmlns:o="urn:schemas-microsoft-com:office:office" xmlns:r="http://schemas.openxmlformats.org/officeDocument/2006/relationships" xmlns:v="urn:schemas-microsoft-com:vml" xmlns:w10="urn:schemas-microsoft-com:office:word" xmlns:w14="http://schemas.microsoft.com/office/word/2010/wordml" xmlns:w="http://schemas.openxmlformats.org/wordprocessingml/2006/main" xmlns:wne="http://schemas.microsoft.com/office/word/2006/wordml" xmlns:wp14="http://schemas.microsoft.com/office/word/2010/wordprocessingDrawing" xmlns:wp="http://schemas.openxmlformats.org/drawingml/2006/wordprocessingDrawing" xmlns:wpc="http://schemas.microsoft.com/office/word/2010/wordprocessingCanvas" xmlns:wpg="http://schemas.microsoft.com/office/word/2010/wordprocessingGroup" xmlns:wpi="http://schemas.microsoft.com/office/word/2010/wordprocessingInk" xmlns:wps="http://schemas.microsoft.com/office/word/2010/wordprocessingShape" mc:Ignorable="w14 wp14">
+  <w:p>
+    <w:pPr>
+      <w:pStyle w:val="Header"/>
+    </w:pPr>
+  </w:p>
+</w:hdr>
+</file>
+
+<file path=word/header3.xml><?xml version="1.0" encoding="utf-8"?>
+<w:hdr xmlns:m="http://schemas.openxmlformats.org/officeDocument/2006/math" xmlns:mc="http://schemas.openxmlformats.org/markup-compatibility/2006" xmlns:mo="http://schemas.microsoft.com/office/mac/office/2008/main" xmlns:mv="urn:schemas-microsoft-com:mac:vml" xmlns:o="urn:schemas-microsoft-com:office:office" xmlns:r="http://schemas.openxmlformats.org/officeDocument/2006/relationships" xmlns:v="urn:schemas-microsoft-com:vml" xmlns:w10="urn:schemas-microsoft-com:office:word" xmlns:w14="http://schemas.microsoft.com/office/word/2010/wordml" xmlns:w="http://schemas.openxmlformats.org/wordprocessingml/2006/main" xmlns:wne="http://schemas.microsoft.com/office/word/2006/wordml" xmlns:wp14="http://schemas.microsoft.com/office/word/2010/wordprocessingDrawing" xmlns:wp="http://schemas.openxmlformats.org/drawingml/2006/wordprocessingDrawing" xmlns:wpc="http://schemas.microsoft.com/office/word/2010/wordprocessingCanvas" xmlns:wpg="http://schemas.microsoft.com/office/word/2010/wordprocessingGroup" xmlns:wpi="http://schemas.microsoft.com/office/word/2010/wordprocessingInk" xmlns:wps="http://schemas.microsoft.com/office/word/2010/wordprocessingShape" mc:Ignorable="w14 wp14">
+  <w:p>
+    <w:pPr>
+      <w:pStyle w:val="Header"/>
+    </w:pPr>
   </w:p>
 </w:hdr>
 </file>

</xml_diff>